<commit_message>
feat: nombrado de informes por direccion, diagramas WinCam, plano tecnico del croquis, contrato de subcontratacion y visor de video CCTV
Incluye trabajo previo sin confirmar (confirmado por el usuario como valido):
- Nombrado de informes con direccion (_informe_stem)
- Diagramas de sentido de flujo en informes WinCam (attach_wincam_diagramas)
- Generacion de plano tecnico a partir del croquis aportado
- Flujo de contrato de subcontratacion + plantillas actualizadas
- Ajustes en core/docx_generator.py

Y anade (esta sesion):
- Transcodificacion de video CCTV a H.264/MP4 al persistirlo (compatibilidad
  navegador + compresion)
- Enlace publico de solo-video (/ver/<token>), sin necesidad de cuenta
- Enlace + codigo QR clicables incrustados en el Word (descriptivo y WinCam)
- ProxyFix para enlaces https:// correctos detras de Railway
- SECRET_KEY ya no hardcodeada (variable de entorno con fallback aleatorio)
</commit_message>
<xml_diff>
--- a/templates/MODELO_ALBANILERIA.docx
+++ b/templates/MODELO_ALBANILERIA.docx
@@ -283,7 +283,7 @@
           <w:sz w:val="28"/>
           <w:szCs w:val="28"/>
         </w:rPr>
-        <w:t>ADMINISTRACION:</w:t>
+        <w:t>[[ADMINISTRACION_LABEL]]</w:t>
       </w:r>
     </w:p>
     <w:p>
@@ -854,7 +854,7 @@
           <w:sz w:val="28"/>
           <w:szCs w:val="28"/>
         </w:rPr>
-        <w:t>Madrid, a [[FECHA_LARGA]]</w:t>
+        <w:t>Madrid a [[FECHA_LARGA]]</w:t>
       </w:r>
     </w:p>
     <w:p>
@@ -2357,7 +2357,7 @@
           <w:rFonts w:ascii="Calibri" w:hAnsi="Calibri" w:cs="Calibri"/>
           <w:color w:val="auto"/>
         </w:rPr>
-        <w:t>Madrid, a [[FECHA_LARGA]]</w:t>
+        <w:t>Madrid a [[FECHA_LARGA]]</w:t>
       </w:r>
     </w:p>
     <w:p>
@@ -5757,7 +5757,7 @@
           <w:szCs w:val="22"/>
           <w:lang w:val="es-MX"/>
         </w:rPr>
-        <w:t xml:space="preserve">                                                              Madrid, a [[FECHA_LARGA]]</w:t>
+        <w:t xml:space="preserve">                                                              Madrid a [[FECHA_LARGA]]</w:t>
       </w:r>
     </w:p>
     <w:sectPr>
@@ -5765,6 +5765,8 @@
       <w:footerReference w:type="default" r:id="rId9"/>
       <w:headerReference w:type="first" r:id="rId10"/>
       <w:footerReference w:type="first" r:id="rId11"/>
+      <w:headerReference w:type="even" r:id="rId14"/>
+      <w:footerReference w:type="even" r:id="rId15"/>
       <w:pgSz w:w="11906" w:h="16838"/>
       <w:pgMar w:top="1300" w:right="746" w:bottom="1134" w:left="1701" w:header="708" w:footer="708" w:gutter="0"/>
       <w:cols w:space="708"/>
@@ -6380,6 +6382,16 @@
 </w:ftr>
 </file>
 
+<file path=word/footer3.xml><?xml version="1.0" encoding="utf-8"?>
+<w:ftr xmlns:m="http://schemas.openxmlformats.org/officeDocument/2006/math" xmlns:mc="http://schemas.openxmlformats.org/markup-compatibility/2006" xmlns:mo="http://schemas.microsoft.com/office/mac/office/2008/main" xmlns:mv="urn:schemas-microsoft-com:mac:vml" xmlns:o="urn:schemas-microsoft-com:office:office" xmlns:r="http://schemas.openxmlformats.org/officeDocument/2006/relationships" xmlns:v="urn:schemas-microsoft-com:vml" xmlns:w10="urn:schemas-microsoft-com:office:word" xmlns:w14="http://schemas.microsoft.com/office/word/2010/wordml" xmlns:w="http://schemas.openxmlformats.org/wordprocessingml/2006/main" xmlns:wne="http://schemas.microsoft.com/office/word/2006/wordml" xmlns:wp14="http://schemas.microsoft.com/office/word/2010/wordprocessingDrawing" xmlns:wp="http://schemas.openxmlformats.org/drawingml/2006/wordprocessingDrawing" xmlns:wpc="http://schemas.microsoft.com/office/word/2010/wordprocessingCanvas" xmlns:wpg="http://schemas.microsoft.com/office/word/2010/wordprocessingGroup" xmlns:wpi="http://schemas.microsoft.com/office/word/2010/wordprocessingInk" xmlns:wps="http://schemas.microsoft.com/office/word/2010/wordprocessingShape" mc:Ignorable="w14 wp14">
+  <w:p>
+    <w:pPr>
+      <w:pStyle w:val="Footer"/>
+    </w:pPr>
+  </w:p>
+</w:ftr>
+</file>
+
 <file path=word/footnotes.xml><?xml version="1.0" encoding="utf-8"?>
 <w:footnotes xmlns:wpc="http://schemas.microsoft.com/office/word/2010/wordprocessingCanvas" xmlns:cx="http://schemas.microsoft.com/office/drawing/2014/chartex" xmlns:cx1="http://schemas.microsoft.com/office/drawing/2015/9/8/chartex" xmlns:cx2="http://schemas.microsoft.com/office/drawing/2015/10/21/chartex" xmlns:cx3="http://schemas.microsoft.com/office/drawing/2016/5/9/chartex" xmlns:cx4="http://schemas.microsoft.com/office/drawing/2016/5/10/chartex" xmlns:cx5="http://schemas.microsoft.com/office/drawing/2016/5/11/chartex" xmlns:cx6="http://schemas.microsoft.com/office/drawing/2016/5/12/chartex" xmlns:cx7="http://schemas.microsoft.com/office/drawing/2016/5/13/chartex" xmlns:cx8="http://schemas.microsoft.com/office/drawing/2016/5/14/chartex" xmlns:mc="http://schemas.openxmlformats.org/markup-compatibility/2006" xmlns:aink="http://schemas.microsoft.com/office/drawing/2016/ink" xmlns:am3d="http://schemas.microsoft.com/office/drawing/2017/model3d" xmlns:o="urn:schemas-microsoft-com:office:office" xmlns:oel="http://schemas.microsoft.com/office/2019/extlst" xmlns:r="http://schemas.openxmlformats.org/officeDocument/2006/relationships" xmlns:m="http://schemas.openxmlformats.org/officeDocument/2006/math" xmlns:v="urn:schemas-microsoft-com:vml" xmlns:wp14="http://schemas.microsoft.com/office/word/2010/wordprocessingDrawing" xmlns:wp="http://schemas.openxmlformats.org/drawingml/2006/wordprocessingDrawing" xmlns:w10="urn:schemas-microsoft-com:office:word" xmlns:w="http://schemas.openxmlformats.org/wordprocessingml/2006/main" xmlns:w14="http://schemas.microsoft.com/office/word/2010/wordml" xmlns:w15="http://schemas.microsoft.com/office/word/2012/wordml" xmlns:w16cex="http://schemas.microsoft.com/office/word/2018/wordml/cex" xmlns:w16cid="http://schemas.microsoft.com/office/word/2016/wordml/cid" xmlns:w16="http://schemas.microsoft.com/office/word/2018/wordml" xmlns:w16du="http://schemas.microsoft.com/office/word/2023/wordml/word16du" xmlns:w16sdtdh="http://schemas.microsoft.com/office/word/2020/wordml/sdtdatahash" xmlns:w16sdtfl="http://schemas.microsoft.com/office/word/2024/wordml/sdtformatlock" xmlns:w16se="http://schemas.microsoft.com/office/word/2015/wordml/symex" xmlns:wpg="http://schemas.microsoft.com/office/word/2010/wordprocessingGroup" xmlns:wpi="http://schemas.microsoft.com/office/word/2010/wordprocessingInk" xmlns:wne="http://schemas.microsoft.com/office/word/2006/wordml" xmlns:wps="http://schemas.microsoft.com/office/word/2010/wordprocessingShape" mc:Ignorable="w14 w15 w16se w16cid w16 w16cex w16sdtdh w16sdtfl w16du wp14">
   <w:footnote w:type="separator" w:id="-1">
@@ -6866,6 +6878,16 @@
   <w:p>
     <w:pPr>
       <w:pStyle w:val="Encabezado"/>
+    </w:pPr>
+  </w:p>
+</w:hdr>
+</file>
+
+<file path=word/header3.xml><?xml version="1.0" encoding="utf-8"?>
+<w:hdr xmlns:m="http://schemas.openxmlformats.org/officeDocument/2006/math" xmlns:mc="http://schemas.openxmlformats.org/markup-compatibility/2006" xmlns:mo="http://schemas.microsoft.com/office/mac/office/2008/main" xmlns:mv="urn:schemas-microsoft-com:mac:vml" xmlns:o="urn:schemas-microsoft-com:office:office" xmlns:r="http://schemas.openxmlformats.org/officeDocument/2006/relationships" xmlns:v="urn:schemas-microsoft-com:vml" xmlns:w10="urn:schemas-microsoft-com:office:word" xmlns:w14="http://schemas.microsoft.com/office/word/2010/wordml" xmlns:w="http://schemas.openxmlformats.org/wordprocessingml/2006/main" xmlns:wne="http://schemas.microsoft.com/office/word/2006/wordml" xmlns:wp14="http://schemas.microsoft.com/office/word/2010/wordprocessingDrawing" xmlns:wp="http://schemas.openxmlformats.org/drawingml/2006/wordprocessingDrawing" xmlns:wpc="http://schemas.microsoft.com/office/word/2010/wordprocessingCanvas" xmlns:wpg="http://schemas.microsoft.com/office/word/2010/wordprocessingGroup" xmlns:wpi="http://schemas.microsoft.com/office/word/2010/wordprocessingInk" xmlns:wps="http://schemas.microsoft.com/office/word/2010/wordprocessingShape" mc:Ignorable="w14 wp14">
+  <w:p>
+    <w:pPr>
+      <w:pStyle w:val="Header"/>
     </w:pPr>
   </w:p>
 </w:hdr>

</xml_diff>